<commit_message>
Fix student numbers on the docx
</commit_message>
<xml_diff>
--- a/submission/group-27-manual.docx
+++ b/submission/group-27-manual.docx
@@ -704,7 +704,13 @@
               <w:rPr>
                 <w:sz w:val="18"/>
               </w:rPr>
-              <w:t>u2473081</w:t>
+              <w:t>u</w:t>
+            </w:r>
+            <w:r>
+              <w:rPr>
+                <w:sz w:val="18"/>
+              </w:rPr>
+              <w:t>24730841</w:t>
             </w:r>
           </w:p>
         </w:tc>
@@ -874,7 +880,13 @@
               <w:rPr>
                 <w:sz w:val="18"/>
               </w:rPr>
-              <w:t>u24742083</w:t>
+              <w:t>u</w:t>
+            </w:r>
+            <w:r>
+              <w:rPr>
+                <w:sz w:val="18"/>
+              </w:rPr>
+              <w:t>24735673</w:t>
             </w:r>
           </w:p>
         </w:tc>
@@ -1246,12 +1258,17 @@
           <w:p>
             <w:pPr>
               <w:spacing w:after="40"/>
+              <w:rPr>
+                <w:sz w:val="18"/>
+                <w:lang w:val="en-ZA"/>
+              </w:rPr>
             </w:pPr>
             <w:r>
               <w:rPr>
                 <w:sz w:val="18"/>
+                <w:lang w:val="en-ZA"/>
               </w:rPr>
-              <w:t>u24735672</w:t>
+              <w:t>u24742083</w:t>
             </w:r>
           </w:p>
         </w:tc>
@@ -2216,7 +2233,6 @@
   <w:style w:type="character" w:default="1" w:styleId="DefaultParagraphFont">
     <w:name w:val="Default Paragraph Font"/>
     <w:uiPriority w:val="1"/>
-    <w:semiHidden/>
     <w:unhideWhenUsed/>
   </w:style>
   <w:style w:type="table" w:default="1" w:styleId="TableNormal">

</xml_diff>

<commit_message>
Added the lecturer-requested paragraph on function and variable distinguishable status
</commit_message>
<xml_diff>
--- a/submission/group-27-manual.docx
+++ b/submission/group-27-manual.docx
@@ -388,6 +388,28 @@
         <w:rPr>
           <w:color w:val="auto"/>
         </w:rPr>
+        <w:t>Variable and Function Names</w:t>
+      </w:r>
+    </w:p>
+    <w:p>
+      <w:pPr>
+        <w:spacing w:after="140"/>
+      </w:pPr>
+      <w:r>
+        <w:t>A variable and a function may share the same SPL name. The compiler distinguishes their uses by the syntax-tree context: a name in a function-call node followed by parameter parentheses resolves to the function, while a name used as an assignment target or value resolves to the variable. Each use is bound to its corresponding symbol, so a program can, for example, assign to #a and call #a ( ) without confusing the two.</w:t>
+      </w:r>
+    </w:p>
+    <w:p>
+      <w:pPr>
+        <w:pStyle w:val="Heading1"/>
+        <w:rPr>
+          <w:color w:val="auto"/>
+        </w:rPr>
+      </w:pPr>
+      <w:r>
+        <w:rPr>
+          <w:color w:val="auto"/>
+        </w:rPr>
         <w:t>Example</w:t>
       </w:r>
     </w:p>
@@ -411,6 +433,7 @@
     </w:p>
     <w:p>
       <w:r>
+        <w:lastRenderedPageBreak/>
         <w:t>Generate XML and C++ output, then compile and run the C++ program:</w:t>
       </w:r>
     </w:p>
@@ -458,7 +481,6 @@
           <w:rFonts w:ascii="Consolas" w:hAnsi="Consolas"/>
           <w:sz w:val="18"/>
         </w:rPr>
-        <w:lastRenderedPageBreak/>
         <w:t>gcc -std=c++11 example.cpp -lstdc++ -o example</w:t>
       </w:r>
       <w:r>

</xml_diff>